<commit_message>
Store daily recap Word us_market_recap_2026-10-17_BJT_us_2026-10-16_final
</commit_message>
<xml_diff>
--- a/reports/us_market_recap_2026-10-17_BJT_us_2026-10-16_final.docx
+++ b/reports/us_market_recap_2026-10-17_BJT_us_2026-10-16_final.docx
@@ -1013,7 +1013,7 @@
                 <w:color w:val="141414"/>
                 <w:sz w:val="16"/>
               </w:rPr>
-              <w:t>101.78 / 99.04 / 8.15万美元</w:t>
+              <w:t>101.78 / 99.04 / 8.12万美元</w:t>
             </w:r>
           </w:p>
         </w:tc>
@@ -1040,7 +1040,7 @@
                 <w:color w:val="141414"/>
                 <w:sz w:val="16"/>
               </w:rPr>
-              <w:t>DXY -0.22% / WTI +1.09% / BTC -0.78%</w:t>
+              <w:t>DXY -0.22% / WTI +1.09% / BTC -1.12%</w:t>
             </w:r>
           </w:p>
         </w:tc>
@@ -3824,7 +3824,7 @@
                 <w:color w:val="141414"/>
                 <w:sz w:val="16"/>
               </w:rPr>
-              <w:t>价格 -11.48%；成交 1.66x均量</w:t>
+              <w:t>价格 -11.48%；成交 1.54x均量</w:t>
             </w:r>
           </w:p>
         </w:tc>
@@ -3935,7 +3935,7 @@
                 <w:color w:val="141414"/>
                 <w:sz w:val="16"/>
               </w:rPr>
-              <w:t>价格 -11.19%；成交 1.61x均量</w:t>
+              <w:t>价格 -11.19%；成交 1.48x均量</w:t>
             </w:r>
           </w:p>
         </w:tc>
@@ -4046,7 +4046,7 @@
                 <w:color w:val="141414"/>
                 <w:sz w:val="16"/>
               </w:rPr>
-              <w:t>价格 -10.57%；成交 0.96x均量</w:t>
+              <w:t>价格 -10.57%；成交 0.92x均量</w:t>
             </w:r>
           </w:p>
         </w:tc>
@@ -4157,7 +4157,7 @@
                 <w:color w:val="141414"/>
                 <w:sz w:val="16"/>
               </w:rPr>
-              <w:t>价格 -9.86%；成交 1.21x均量</w:t>
+              <w:t>价格 -9.86%；成交 1.20x均量</w:t>
             </w:r>
           </w:p>
         </w:tc>
@@ -4268,7 +4268,7 @@
                 <w:color w:val="141414"/>
                 <w:sz w:val="16"/>
               </w:rPr>
-              <w:t>价格 -9.75%；成交 1.51x均量</w:t>
+              <w:t>价格 -9.75%；成交 2.17x均量</w:t>
             </w:r>
           </w:p>
         </w:tc>
@@ -4379,7 +4379,7 @@
                 <w:color w:val="141414"/>
                 <w:sz w:val="16"/>
               </w:rPr>
-              <w:t>价格 -9.56%；成交 1.43x均量</w:t>
+              <w:t>价格 -9.56%；成交 1.26x均量</w:t>
             </w:r>
           </w:p>
         </w:tc>
@@ -4893,7 +4893,7 @@
         <w:t>APLD</w:t>
       </w:r>
       <w:r>
-        <w:t xml:space="preserve"> -11.48%（成交约1.66x均量）；</w:t>
+        <w:t xml:space="preserve"> -11.48%（成交约1.54x均量）；</w:t>
       </w:r>
       <w:r>
         <w:rPr>
@@ -4902,7 +4902,7 @@
         <w:t>IREN</w:t>
       </w:r>
       <w:r>
-        <w:t xml:space="preserve"> -11.19%（成交约1.61x均量）；</w:t>
+        <w:t xml:space="preserve"> -11.19%（成交约1.48x均量）；</w:t>
       </w:r>
       <w:r>
         <w:rPr>
@@ -4911,7 +4911,7 @@
         <w:t>LCID</w:t>
       </w:r>
       <w:r>
-        <w:t xml:space="preserve"> -10.57%（成交约0.96x均量）；</w:t>
+        <w:t xml:space="preserve"> -10.57%（成交约0.92x均量）；</w:t>
       </w:r>
       <w:r>
         <w:rPr>
@@ -4920,7 +4920,7 @@
         <w:t>SMCI</w:t>
       </w:r>
       <w:r>
-        <w:t xml:space="preserve"> -9.86%（成交约1.21x均量）；</w:t>
+        <w:t xml:space="preserve"> -9.86%（成交约1.20x均量）；</w:t>
       </w:r>
       <w:r>
         <w:rPr>
@@ -4929,7 +4929,7 @@
         <w:t>AAOI</w:t>
       </w:r>
       <w:r>
-        <w:t xml:space="preserve"> -9.75%（成交约1.51x均量）；</w:t>
+        <w:t xml:space="preserve"> -9.75%（成交约2.17x均量）；</w:t>
       </w:r>
       <w:r>
         <w:rPr>
@@ -4938,7 +4938,7 @@
         <w:t>MSTR</w:t>
       </w:r>
       <w:r>
-        <w:t xml:space="preserve"> -9.56%（成交约1.43x均量）。这些名字先记录为价格/成交异常，随后核对同日公告、研报、公司交流、行业数据或传闻原始出处；没有证据时保留“待验”，不把涨跌倒推成原因。</w:t>
+        <w:t xml:space="preserve"> -9.56%（成交约1.26x均量）。这些名字先记录为价格/成交异常，随后核对同日公告、研报、公司交流、行业数据或传闻原始出处；没有证据时保留“待验”，不把涨跌倒推成原因。</w:t>
       </w:r>
     </w:p>
     <w:p>
@@ -6257,7 +6257,7 @@
                 <w:color w:val="141414"/>
                 <w:sz w:val="16"/>
               </w:rPr>
-              <w:t>1.66x均量</w:t>
+              <w:t>1.54x均量</w:t>
             </w:r>
           </w:p>
         </w:tc>
@@ -6368,7 +6368,7 @@
                 <w:color w:val="141414"/>
                 <w:sz w:val="16"/>
               </w:rPr>
-              <w:t>1.61x均量</w:t>
+              <w:t>1.48x均量</w:t>
             </w:r>
           </w:p>
         </w:tc>
@@ -6479,7 +6479,7 @@
                 <w:color w:val="141414"/>
                 <w:sz w:val="16"/>
               </w:rPr>
-              <w:t>0.96x均量</w:t>
+              <w:t>0.92x均量</w:t>
             </w:r>
           </w:p>
         </w:tc>
@@ -6590,7 +6590,7 @@
                 <w:color w:val="141414"/>
                 <w:sz w:val="16"/>
               </w:rPr>
-              <w:t>1.21x均量</w:t>
+              <w:t>1.20x均量</w:t>
             </w:r>
           </w:p>
         </w:tc>
@@ -6701,7 +6701,7 @@
                 <w:color w:val="141414"/>
                 <w:sz w:val="16"/>
               </w:rPr>
-              <w:t>1.51x均量</w:t>
+              <w:t>2.17x均量</w:t>
             </w:r>
           </w:p>
         </w:tc>
@@ -6812,7 +6812,7 @@
                 <w:color w:val="141414"/>
                 <w:sz w:val="16"/>
               </w:rPr>
-              <w:t>1.43x均量</w:t>
+              <w:t>1.26x均量</w:t>
             </w:r>
           </w:p>
         </w:tc>
@@ -7178,7 +7178,7 @@
                 <w:color w:val="141414"/>
                 <w:sz w:val="16"/>
               </w:rPr>
-              <w:t>不可得</w:t>
+              <w:t>2026-10-30</w:t>
             </w:r>
           </w:p>
         </w:tc>
@@ -7204,7 +7204,7 @@
                 <w:color w:val="141414"/>
                 <w:sz w:val="16"/>
               </w:rPr>
-              <w:t>nan</w:t>
+              <w:t>1.20</w:t>
             </w:r>
           </w:p>
         </w:tc>
@@ -7230,7 +7230,7 @@
                 <w:color w:val="141414"/>
                 <w:sz w:val="16"/>
               </w:rPr>
-              <w:t>nan%</w:t>
+              <w:t>8.6%</w:t>
             </w:r>
           </w:p>
         </w:tc>
@@ -7256,7 +7256,7 @@
                 <w:color w:val="141414"/>
                 <w:sz w:val="16"/>
               </w:rPr>
-              <w:t>source unavailable</w:t>
+              <w:t>无阈值报警</w:t>
             </w:r>
           </w:p>
         </w:tc>
@@ -8130,7 +8130,7 @@
                 <w:color w:val="141414"/>
                 <w:sz w:val="16"/>
               </w:rPr>
-              <w:t>不可得</w:t>
+              <w:t>2026-10-30</w:t>
             </w:r>
           </w:p>
         </w:tc>
@@ -8156,7 +8156,7 @@
                 <w:color w:val="141414"/>
                 <w:sz w:val="16"/>
               </w:rPr>
-              <w:t>nan</w:t>
+              <w:t>1.47</w:t>
             </w:r>
           </w:p>
         </w:tc>
@@ -8182,7 +8182,7 @@
                 <w:color w:val="141414"/>
                 <w:sz w:val="16"/>
               </w:rPr>
-              <w:t>nan%</w:t>
+              <w:t>8.6%</w:t>
             </w:r>
           </w:p>
         </w:tc>
@@ -8208,7 +8208,7 @@
                 <w:color w:val="141414"/>
                 <w:sz w:val="16"/>
               </w:rPr>
-              <w:t>source unavailable</w:t>
+              <w:t>无阈值报警</w:t>
             </w:r>
           </w:p>
         </w:tc>
@@ -8402,7 +8402,7 @@
                 <w:color w:val="141414"/>
                 <w:sz w:val="16"/>
               </w:rPr>
-              <w:t>不可得</w:t>
+              <w:t>2026-11-20</w:t>
             </w:r>
           </w:p>
         </w:tc>
@@ -8428,7 +8428,7 @@
                 <w:color w:val="141414"/>
                 <w:sz w:val="16"/>
               </w:rPr>
-              <w:t>nan</w:t>
+              <w:t>0.95</w:t>
             </w:r>
           </w:p>
         </w:tc>
@@ -8454,7 +8454,7 @@
                 <w:color w:val="141414"/>
                 <w:sz w:val="16"/>
               </w:rPr>
-              <w:t>nan%</w:t>
+              <w:t>19.3%</w:t>
             </w:r>
           </w:p>
         </w:tc>
@@ -8480,7 +8480,7 @@
                 <w:color w:val="141414"/>
                 <w:sz w:val="16"/>
               </w:rPr>
-              <w:t>source unavailable</w:t>
+              <w:t>strike-concentration</w:t>
             </w:r>
           </w:p>
         </w:tc>
@@ -8538,7 +8538,7 @@
                 <w:color w:val="141414"/>
                 <w:sz w:val="16"/>
               </w:rPr>
-              <w:t>不可得</w:t>
+              <w:t>2026-10-30</w:t>
             </w:r>
           </w:p>
         </w:tc>
@@ -8564,7 +8564,7 @@
                 <w:color w:val="141414"/>
                 <w:sz w:val="16"/>
               </w:rPr>
-              <w:t>nan</w:t>
+              <w:t>0.76</w:t>
             </w:r>
           </w:p>
         </w:tc>
@@ -8590,7 +8590,7 @@
                 <w:color w:val="141414"/>
                 <w:sz w:val="16"/>
               </w:rPr>
-              <w:t>nan%</w:t>
+              <w:t>10.1%</w:t>
             </w:r>
           </w:p>
         </w:tc>
@@ -8616,7 +8616,7 @@
                 <w:color w:val="141414"/>
                 <w:sz w:val="16"/>
               </w:rPr>
-              <w:t>source unavailable</w:t>
+              <w:t>strike-concentration</w:t>
             </w:r>
           </w:p>
         </w:tc>
@@ -8674,7 +8674,7 @@
                 <w:color w:val="141414"/>
                 <w:sz w:val="16"/>
               </w:rPr>
-              <w:t>不可得</w:t>
+              <w:t>2026-11-20</w:t>
             </w:r>
           </w:p>
         </w:tc>
@@ -8700,7 +8700,7 @@
                 <w:color w:val="141414"/>
                 <w:sz w:val="16"/>
               </w:rPr>
-              <w:t>nan</w:t>
+              <w:t>0.90</w:t>
             </w:r>
           </w:p>
         </w:tc>
@@ -8726,7 +8726,7 @@
                 <w:color w:val="141414"/>
                 <w:sz w:val="16"/>
               </w:rPr>
-              <w:t>nan%</w:t>
+              <w:t>24.7%</w:t>
             </w:r>
           </w:p>
         </w:tc>
@@ -8752,7 +8752,7 @@
                 <w:color w:val="141414"/>
                 <w:sz w:val="16"/>
               </w:rPr>
-              <w:t>source unavailable</w:t>
+              <w:t>put-volume/OI&gt;=2, strike-concentration</w:t>
             </w:r>
           </w:p>
         </w:tc>
@@ -9082,7 +9082,7 @@
                 <w:color w:val="141414"/>
                 <w:sz w:val="16"/>
               </w:rPr>
-              <w:t>不可得</w:t>
+              <w:t>2026-10-30</w:t>
             </w:r>
           </w:p>
         </w:tc>
@@ -9108,7 +9108,7 @@
                 <w:color w:val="141414"/>
                 <w:sz w:val="16"/>
               </w:rPr>
-              <w:t>nan</w:t>
+              <w:t>13.25</w:t>
             </w:r>
           </w:p>
         </w:tc>
@@ -9134,7 +9134,7 @@
                 <w:color w:val="141414"/>
                 <w:sz w:val="16"/>
               </w:rPr>
-              <w:t>nan%</w:t>
+              <w:t>23.5%</w:t>
             </w:r>
           </w:p>
         </w:tc>
@@ -9160,7 +9160,7 @@
                 <w:color w:val="141414"/>
                 <w:sz w:val="16"/>
               </w:rPr>
-              <w:t>source unavailable</w:t>
+              <w:t>call-heavy, strike-concentration</w:t>
             </w:r>
           </w:p>
         </w:tc>
@@ -9179,7 +9179,7 @@
       <w:r>
         <w:drawing>
           <wp:inline xmlns:a="http://schemas.openxmlformats.org/drawingml/2006/main" xmlns:pic="http://schemas.openxmlformats.org/drawingml/2006/picture">
-            <wp:extent cx="5806440" cy="3417859"/>
+            <wp:extent cx="5806440" cy="2955648"/>
             <wp:docPr id="25" name="Picture 25"/>
             <wp:cNvGraphicFramePr>
               <a:graphicFrameLocks noChangeAspect="1"/>
@@ -9200,7 +9200,7 @@
                   <pic:spPr>
                     <a:xfrm>
                       <a:off x="0" y="0"/>
-                      <a:ext cx="5806440" cy="3417859"/>
+                      <a:ext cx="5806440" cy="2955648"/>
                     </a:xfrm>
                     <a:prstGeom prst="rect"/>
                   </pic:spPr>
@@ -9221,7 +9221,7 @@
           <w:color w:val="555555"/>
           <w:sz w:val="17"/>
         </w:rPr>
-        <w:t>图：公开期权链异常扫描。来源/口径：Nasdaq public option-chain endpoint；检查时点 2026-10-16T19:53:47-04:00；无执行方向确认。。</w:t>
+        <w:t>图：公开期权链异常扫描。来源/口径：Nasdaq public option-chain endpoint；检查时点 2026-10-16T21:16:16-04:00；无执行方向确认。。</w:t>
       </w:r>
     </w:p>
     <w:p>
@@ -9230,15 +9230,6 @@
       </w:pPr>
       <w:r>
         <w:t xml:space="preserve">解读规则：本次触发异常阈值的标的为 </w:t>
-      </w:r>
-      <w:r>
-        <w:rPr>
-          <w:shd w:fill="E7E6E6"/>
-        </w:rPr>
-        <w:t>LITE</w:t>
-      </w:r>
-      <w:r>
-        <w:t xml:space="preserve">, </w:t>
       </w:r>
       <w:r>
         <w:rPr>
@@ -9254,15 +9245,6 @@
           <w:shd w:fill="E7E6E6"/>
         </w:rPr>
         <w:t>SNDK</w:t>
-      </w:r>
-      <w:r>
-        <w:t xml:space="preserve">, </w:t>
-      </w:r>
-      <w:r>
-        <w:rPr>
-          <w:shd w:fill="E7E6E6"/>
-        </w:rPr>
-        <w:t>AVGO</w:t>
       </w:r>
       <w:r>
         <w:t xml:space="preserve">, </w:t>
@@ -9353,7 +9335,7 @@
       <w:r>
         <w:drawing>
           <wp:inline xmlns:a="http://schemas.openxmlformats.org/drawingml/2006/main" xmlns:pic="http://schemas.openxmlformats.org/drawingml/2006/picture">
-            <wp:extent cx="5806440" cy="2269967"/>
+            <wp:extent cx="5806440" cy="3193704"/>
             <wp:docPr id="26" name="Picture 26"/>
             <wp:cNvGraphicFramePr>
               <a:graphicFrameLocks noChangeAspect="1"/>
@@ -9374,7 +9356,7 @@
                   <pic:spPr>
                     <a:xfrm>
                       <a:off x="0" y="0"/>
-                      <a:ext cx="5806440" cy="2269967"/>
+                      <a:ext cx="5806440" cy="3193704"/>
                     </a:xfrm>
                     <a:prstGeom prst="rect"/>
                   </pic:spPr>

</xml_diff>